<commit_message>
Mark SSRN/Zenodo as updated to v30; repo consistency pass
SSRN preprint and Zenodo record are now updated to the v30 (721-case real)
figures. Update publication-status notes in README and marco_teorico_v30 (ES+EN)
accordingly, bump the three unreleased-paper notes from "v29" to "v30", and
regenerate the v30 PDF/DOCX (ES+EN).

Co-Authored-By: Claude Opus 4.8 <noreply@anthropic.com>
Claude-Session: https://claude.ai/code/session_01WyPQzxUoMWQjXGvfztbcLN
</commit_message>
<xml_diff>
--- a/papers/marco_teorico_v30.docx
+++ b/papers/marco_teorico_v30.docx
@@ -5981,12 +5981,18 @@
         <w:t>SSRN (abstract 6418778):</w:t>
       </w:r>
       <w:r>
-        <w:t xml:space="preserve"> PUBLICADO — preprint activo. Cifras v28; actualizar</w:t>
-      </w:r>
-    </w:p>
-    <w:p>
-      <w:r>
-        <w:t xml:space="preserve">  a v30.</w:t>
+        <w:t xml:space="preserve"> PUBLICADO — preprint activo, </w:t>
+      </w:r>
+      <w:r>
+        <w:rPr>
+          <w:b/>
+        </w:rPr>
+        <w:t>actualizado a v30</w:t>
+      </w:r>
+    </w:p>
+    <w:p>
+      <w:r>
+        <w:t xml:space="preserve">  (corpus de 721 casos reales).</w:t>
       </w:r>
     </w:p>
     <w:p>
@@ -6000,7 +6006,18 @@
         <w:t>Zenodo (DOI 10.5281/zenodo.19446521):</w:t>
       </w:r>
       <w:r>
-        <w:t xml:space="preserve"> PUBLICADO — v2.5.0.</w:t>
+        <w:t xml:space="preserve"> PUBLICADO — </w:t>
+      </w:r>
+      <w:r>
+        <w:rPr>
+          <w:b/>
+        </w:rPr>
+        <w:t>actualizado a v30</w:t>
+      </w:r>
+    </w:p>
+    <w:p>
+      <w:r>
+        <w:t xml:space="preserve">  (corpus de 721 casos reales).</w:t>
       </w:r>
     </w:p>
     <w:p>

</xml_diff>

<commit_message>
Repo consistency pass: correct SSRN status + stale version labels
Final review fixes: SSRN status corrected (live paper is still v2.3.1/502; v30
revision prepared in snt_ssrn_v30_EN, pending re-submission) in README and marco
(ES+EN); Zenodo noted as record-updated to v2.5.0; PLOS/findings/RC-table labels
bumped v29->v30; README corpus header v2.4.0->v2.5.0; sovereignty-brake row uses
real counts (B n=446, E2) instead of the retired synthetic 230/4. Marco PDFs/DOCX
re-rendered.

Co-Authored-By: Claude Opus 4.8 <noreply@anthropic.com>
Claude-Session: https://claude.ai/code/session_01WyPQzxUoMWQjXGvfztbcLN
</commit_message>
<xml_diff>
--- a/papers/marco_teorico_v30.docx
+++ b/papers/marco_teorico_v30.docx
@@ -5981,7 +5981,45 @@
         <w:t>SSRN (abstract 6418778):</w:t>
       </w:r>
       <w:r>
-        <w:t xml:space="preserve"> PUBLICADO — preprint activo, </w:t>
+        <w:t xml:space="preserve"> PUBLICADO — el paper en línea sigue en v2.3.1 (502</w:t>
+      </w:r>
+    </w:p>
+    <w:p>
+      <w:r>
+        <w:t xml:space="preserve">  casos); </w:t>
+      </w:r>
+      <w:r>
+        <w:rPr>
+          <w:b/>
+        </w:rPr>
+        <w:t>revisión v30 preparada</w:t>
+      </w:r>
+      <w:r>
+        <w:t xml:space="preserve"> (</w:t>
+      </w:r>
+      <w:r>
+        <w:rPr>
+          <w:rFonts w:ascii="Consolas" w:hAnsi="Consolas"/>
+          <w:sz w:val="18"/>
+        </w:rPr>
+        <w:t>papers/snt_ssrn_v30_EN</w:t>
+      </w:r>
+      <w:r>
+        <w:t>), pendiente de re-subir.</w:t>
+      </w:r>
+    </w:p>
+    <w:p>
+      <w:pPr>
+        <w:pStyle w:val="ListBullet"/>
+      </w:pPr>
+      <w:r>
+        <w:rPr>
+          <w:b/>
+        </w:rPr>
+        <w:t>Zenodo (DOI 10.5281/zenodo.19446521):</w:t>
+      </w:r>
+      <w:r>
+        <w:t xml:space="preserve"> PUBLICADO — </w:t>
       </w:r>
       <w:r>
         <w:rPr>
@@ -6003,31 +6041,6 @@
         <w:rPr>
           <w:b/>
         </w:rPr>
-        <w:t>Zenodo (DOI 10.5281/zenodo.19446521):</w:t>
-      </w:r>
-      <w:r>
-        <w:t xml:space="preserve"> PUBLICADO — </w:t>
-      </w:r>
-      <w:r>
-        <w:rPr>
-          <w:b/>
-        </w:rPr>
-        <w:t>actualizado a v30</w:t>
-      </w:r>
-    </w:p>
-    <w:p>
-      <w:r>
-        <w:t xml:space="preserve">  (corpus de 721 casos reales).</w:t>
-      </w:r>
-    </w:p>
-    <w:p>
-      <w:pPr>
-        <w:pStyle w:val="ListBullet"/>
-      </w:pPr>
-      <w:r>
-        <w:rPr>
-          <w:b/>
-        </w:rPr>
         <w:t>PLOS Complex Systems (PCSY-D-26-00059):</w:t>
       </w:r>
       <w:r>
@@ -6036,7 +6049,7 @@
     </w:p>
     <w:p>
       <w:r>
-        <w:t xml:space="preserve">  2026. Cifras actualizadas a v29 (721 casos). Editor: Haroldo V. Ribeiro;</w:t>
+        <w:t xml:space="preserve">  2026. Cifras actualizadas a v30 (721 casos). Editor: Haroldo V. Ribeiro;</w:t>
       </w:r>
     </w:p>
     <w:p>

</xml_diff>

<commit_message>
SSRN v30 revision submitted: add SSRN_revision_v30 metadata + mark status
User submitted the v30 revision to SSRN (28 Jun 2026). Add papers/SSRN_revision_v30.md
(title, abstract, keywords, JEL as submitted) and update status to REVISION
SUBMITTED in README and marco (ES+EN); marco PDFs/DOCX re-rendered.

Co-Authored-By: Claude Opus 4.8 <noreply@anthropic.com>
Claude-Session: https://claude.ai/code/session_01WyPQzxUoMWQjXGvfztbcLN
</commit_message>
<xml_diff>
--- a/papers/marco_teorico_v30.docx
+++ b/papers/marco_teorico_v30.docx
@@ -5981,21 +5981,21 @@
         <w:t>SSRN (abstract 6418778):</w:t>
       </w:r>
       <w:r>
-        <w:t xml:space="preserve"> PUBLICADO — el paper en línea sigue en v2.3.1 (502</w:t>
-      </w:r>
-    </w:p>
-    <w:p>
-      <w:r>
-        <w:t xml:space="preserve">  casos); </w:t>
+        <w:t xml:space="preserve"> </w:t>
       </w:r>
       <w:r>
         <w:rPr>
           <w:b/>
         </w:rPr>
-        <w:t>revisión v30 preparada</w:t>
-      </w:r>
-      <w:r>
-        <w:t xml:space="preserve"> (</w:t>
+        <w:t>REVISIÓN v30 ENVIADA</w:t>
+      </w:r>
+      <w:r>
+        <w:t xml:space="preserve"> (28 jun 2026,</w:t>
+      </w:r>
+    </w:p>
+    <w:p>
+      <w:r>
+        <w:t xml:space="preserve">  </w:t>
       </w:r>
       <w:r>
         <w:rPr>
@@ -6005,7 +6005,7 @@
         <w:t>papers/snt_ssrn_v30_EN</w:t>
       </w:r>
       <w:r>
-        <w:t>), pendiente de re-subir.</w:t>
+        <w:t>); reemplaza la v2.3.1/502; en revisión por SSRN.</w:t>
       </w:r>
     </w:p>
     <w:p>

</xml_diff>